<commit_message>
Update authors to 5 co-authors, deslop and humanize acknowledgment, remove duplicate references and Capstone mentions
</commit_message>
<xml_diff>
--- a/LogShield_IEEE_Paper_Official.docx
+++ b/LogShield_IEEE_Paper_Official.docx
@@ -16,6 +16,163 @@
         </w:rPr>
         <w:t>LogShield: In-Pod Secret Sanitization and Autonomous Closed-Loop Containment for Cloud-Native Microservices</w:t>
       </w:r>
+    </w:p>
+    <w:tbl>
+      <w:tblPr>
+        <w:tblW w:type="auto" w:w="0"/>
+        <w:jc w:val="center"/>
+        <w:tblLook w:firstColumn="1" w:firstRow="1" w:lastColumn="0" w:lastRow="0" w:noHBand="0" w:noVBand="1" w:val="04A0"/>
+      </w:tblPr>
+      <w:tblGrid>
+        <w:gridCol w:w="3480"/>
+        <w:gridCol w:w="3480"/>
+        <w:gridCol w:w="3480"/>
+      </w:tblGrid>
+      <w:tr>
+        <w:tc>
+          <w:tcPr>
+            <w:tcW w:type="dxa" w:w="3456"/>
+            <w:tcBorders>
+              <w:top w:val="none"/>
+              <w:bottom w:val="none"/>
+              <w:left w:val="none"/>
+              <w:right w:val="none"/>
+            </w:tcBorders>
+          </w:tcPr>
+          <w:p>
+            <w:pPr>
+              <w:spacing w:line="252" w:lineRule="auto" w:after="0"/>
+              <w:jc w:val="center"/>
+            </w:pPr>
+            <w:r>
+              <w:rPr>
+                <w:rFonts w:ascii="Times New Roman" w:hAnsi="Times New Roman"/>
+                <w:b/>
+                <w:sz w:val="21"/>
+              </w:rPr>
+              <w:t>Rounak Neema</w:t>
+              <w:br/>
+            </w:r>
+            <w:r>
+              <w:rPr>
+                <w:rFonts w:ascii="Times New Roman" w:hAnsi="Times New Roman"/>
+                <w:sz w:val="17"/>
+              </w:rPr>
+              <w:t>Dept. of Computer Engineering</w:t>
+              <w:br/>
+              <w:t>MPSTME, NMIMS University</w:t>
+              <w:br/>
+              <w:t>Mumbai, India</w:t>
+              <w:br/>
+            </w:r>
+            <w:r>
+              <w:rPr>
+                <w:rFonts w:ascii="Times New Roman" w:hAnsi="Times New Roman"/>
+                <w:i/>
+                <w:sz w:val="17"/>
+              </w:rPr>
+              <w:t>rounak.neema046@nmims.in</w:t>
+            </w:r>
+          </w:p>
+        </w:tc>
+        <w:tc>
+          <w:tcPr>
+            <w:tcW w:type="dxa" w:w="3456"/>
+            <w:tcBorders>
+              <w:top w:val="none"/>
+              <w:bottom w:val="none"/>
+              <w:left w:val="none"/>
+              <w:right w:val="none"/>
+            </w:tcBorders>
+          </w:tcPr>
+          <w:p>
+            <w:pPr>
+              <w:spacing w:line="252" w:lineRule="auto" w:after="0"/>
+              <w:jc w:val="center"/>
+            </w:pPr>
+            <w:r>
+              <w:rPr>
+                <w:rFonts w:ascii="Times New Roman" w:hAnsi="Times New Roman"/>
+                <w:b/>
+                <w:sz w:val="21"/>
+              </w:rPr>
+              <w:t>Manas Borse</w:t>
+              <w:br/>
+            </w:r>
+            <w:r>
+              <w:rPr>
+                <w:rFonts w:ascii="Times New Roman" w:hAnsi="Times New Roman"/>
+                <w:sz w:val="17"/>
+              </w:rPr>
+              <w:t>Dept. of Computer Engineering</w:t>
+              <w:br/>
+              <w:t>MPSTME, NMIMS University</w:t>
+              <w:br/>
+              <w:t>Mumbai, India</w:t>
+              <w:br/>
+            </w:r>
+            <w:r>
+              <w:rPr>
+                <w:rFonts w:ascii="Times New Roman" w:hAnsi="Times New Roman"/>
+                <w:i/>
+                <w:sz w:val="17"/>
+              </w:rPr>
+              <w:t>manas.borse057@nmims.in</w:t>
+            </w:r>
+          </w:p>
+        </w:tc>
+        <w:tc>
+          <w:tcPr>
+            <w:tcW w:type="dxa" w:w="3456"/>
+            <w:tcBorders>
+              <w:top w:val="none"/>
+              <w:bottom w:val="none"/>
+              <w:left w:val="none"/>
+              <w:right w:val="none"/>
+            </w:tcBorders>
+          </w:tcPr>
+          <w:p>
+            <w:pPr>
+              <w:spacing w:line="252" w:lineRule="auto" w:after="0"/>
+              <w:jc w:val="center"/>
+            </w:pPr>
+            <w:r>
+              <w:rPr>
+                <w:rFonts w:ascii="Times New Roman" w:hAnsi="Times New Roman"/>
+                <w:b/>
+                <w:sz w:val="21"/>
+              </w:rPr>
+              <w:t>Arnab Chowdhury</w:t>
+              <w:br/>
+            </w:r>
+            <w:r>
+              <w:rPr>
+                <w:rFonts w:ascii="Times New Roman" w:hAnsi="Times New Roman"/>
+                <w:sz w:val="17"/>
+              </w:rPr>
+              <w:t>Dept. of Computer Engineering</w:t>
+              <w:br/>
+              <w:t>MPSTME, NMIMS University</w:t>
+              <w:br/>
+              <w:t>Mumbai, India</w:t>
+              <w:br/>
+            </w:r>
+            <w:r>
+              <w:rPr>
+                <w:rFonts w:ascii="Times New Roman" w:hAnsi="Times New Roman"/>
+                <w:i/>
+                <w:sz w:val="17"/>
+              </w:rPr>
+              <w:t>arnab.chowdhury032@nmims.in</w:t>
+            </w:r>
+          </w:p>
+        </w:tc>
+      </w:tr>
+    </w:tbl>
+    <w:p>
+      <w:pPr>
+        <w:spacing w:before="80" w:after="0" w:line="240" w:lineRule="auto"/>
+      </w:pPr>
     </w:p>
     <w:tbl>
       <w:tblPr>
@@ -30,7 +187,7 @@
       <w:tr>
         <w:tc>
           <w:tcPr>
-            <w:tcW w:type="dxa" w:w="5040"/>
+            <w:tcW w:type="dxa" w:w="4032"/>
             <w:tcBorders>
               <w:top w:val="none"/>
               <w:bottom w:val="none"/>
@@ -40,58 +197,43 @@
           </w:tcPr>
           <w:p>
             <w:pPr>
-              <w:spacing w:line="240" w:lineRule="auto" w:after="0"/>
+              <w:spacing w:line="252" w:lineRule="auto" w:after="0"/>
               <w:jc w:val="center"/>
             </w:pPr>
             <w:r>
               <w:rPr>
                 <w:rFonts w:ascii="Times New Roman" w:hAnsi="Times New Roman"/>
                 <w:b/>
-                <w:sz w:val="22"/>
+                <w:sz w:val="21"/>
               </w:rPr>
-              <w:t>Rounak Neema</w:t>
+              <w:t>Prince Roy</w:t>
               <w:br/>
             </w:r>
             <w:r>
               <w:rPr>
                 <w:rFonts w:ascii="Times New Roman" w:hAnsi="Times New Roman"/>
-                <w:sz w:val="20"/>
+                <w:sz w:val="17"/>
               </w:rPr>
-              <w:t>Department of Computer Engineering</w:t>
+              <w:t>Dept. of Computer Engineering</w:t>
               <w:br/>
-            </w:r>
-            <w:r>
-              <w:rPr>
-                <w:rFonts w:ascii="Times New Roman" w:hAnsi="Times New Roman"/>
-                <w:sz w:val="19"/>
-              </w:rPr>
-              <w:t>Mukesh Patel School of Technology</w:t>
+              <w:t>MPSTME, NMIMS University</w:t>
               <w:br/>
-              <w:t>Management &amp; Engineering</w:t>
-              <w:br/>
-              <w:t>NMIMS University</w:t>
-              <w:br/>
-            </w:r>
-            <w:r>
-              <w:rPr>
-                <w:rFonts w:ascii="Times New Roman" w:hAnsi="Times New Roman"/>
-                <w:sz w:val="19"/>
-              </w:rPr>
               <w:t>Mumbai, India</w:t>
               <w:br/>
             </w:r>
             <w:r>
               <w:rPr>
                 <w:rFonts w:ascii="Times New Roman" w:hAnsi="Times New Roman"/>
-                <w:sz w:val="19"/>
+                <w:i/>
+                <w:sz w:val="17"/>
               </w:rPr>
-              <w:t>rounak.neema@nmims.edu</w:t>
+              <w:t>prince.roy031@nmims.in</w:t>
             </w:r>
           </w:p>
         </w:tc>
         <w:tc>
           <w:tcPr>
-            <w:tcW w:type="dxa" w:w="5040"/>
+            <w:tcW w:type="dxa" w:w="4032"/>
             <w:tcBorders>
               <w:top w:val="none"/>
               <w:bottom w:val="none"/>
@@ -101,42 +243,37 @@
           </w:tcPr>
           <w:p>
             <w:pPr>
-              <w:spacing w:line="240" w:lineRule="auto" w:after="0"/>
+              <w:spacing w:line="252" w:lineRule="auto" w:after="0"/>
               <w:jc w:val="center"/>
             </w:pPr>
             <w:r>
               <w:rPr>
                 <w:rFonts w:ascii="Times New Roman" w:hAnsi="Times New Roman"/>
                 <w:b/>
-                <w:sz w:val="22"/>
+                <w:sz w:val="21"/>
               </w:rPr>
-              <w:t>Capstone Research Group</w:t>
+              <w:t>Rudrani Ingle</w:t>
               <w:br/>
             </w:r>
             <w:r>
               <w:rPr>
                 <w:rFonts w:ascii="Times New Roman" w:hAnsi="Times New Roman"/>
-                <w:sz w:val="20"/>
+                <w:sz w:val="17"/>
               </w:rPr>
-              <w:t>Cloud-Native Security Laboratory</w:t>
+              <w:t>Dept. of Computer Engineering</w:t>
               <w:br/>
-              <w:t>Project LogShield Initiative</w:t>
+              <w:t>MPSTME, NMIMS University</w:t>
               <w:br/>
-            </w:r>
-            <w:r>
-              <w:rPr>
-                <w:rFonts w:ascii="Times New Roman" w:hAnsi="Times New Roman"/>
-                <w:sz w:val="19"/>
-              </w:rPr>
               <w:t>Mumbai, India</w:t>
               <w:br/>
             </w:r>
             <w:r>
               <w:rPr>
                 <w:rFonts w:ascii="Times New Roman" w:hAnsi="Times New Roman"/>
-                <w:sz w:val="19"/>
+                <w:i/>
+                <w:sz w:val="17"/>
               </w:rPr>
-              <w:t>research@logshield.internal</w:t>
+              <w:t>Rudrani.Ingle@nmims.edu</w:t>
             </w:r>
           </w:p>
         </w:tc>
@@ -203,21 +340,6 @@
           <w:sz w:val="18"/>
         </w:rPr>
         <w:t>Cloud-native security, Kubernetes sidecar, log sanitization, secret detection, CWE-532, Shannon entropy, Aho-Corasick automaton, NetworkPolicy quarantine, secret lineage.</w:t>
-      </w:r>
-    </w:p>
-    <w:p>
-      <w:pPr>
-        <w:spacing w:line="240" w:lineRule="auto" w:after="160"/>
-        <w:ind w:firstLine="0"/>
-        <w:jc w:val="left"/>
-      </w:pPr>
-      <w:r>
-        <w:rPr>
-          <w:rFonts w:ascii="Times New Roman" w:hAnsi="Times New Roman"/>
-          <w:i/>
-          <w:sz w:val="16"/>
-        </w:rPr>
-        <w:t>This study was conducted as part of the Capstone Project in Computer Engineering, concentrating on Cloud-Native Security and Information Assurance.</w:t>
       </w:r>
     </w:p>
     <w:p>
@@ -3061,17 +3183,6 @@
         </w:rPr>
         <w:t>This integer formulation executes in under 14 microseconds per candidate token, providing statistically grounded and predictable real-time execution.</w:t>
       </w:r>
-    </w:p>
-    <w:p>
-      <w:pPr>
-        <w:sectPr>
-          <w:type w:val="continuous"/>
-          <w:pgSz w:w="12240" w:h="15840"/>
-          <w:pgMar w:top="1080" w:right="900" w:bottom="1440" w:left="900" w:header="720" w:footer="720" w:gutter="0"/>
-          <w:cols w:space="360" w:num="2"/>
-          <w:docGrid w:linePitch="360"/>
-        </w:sectPr>
-      </w:pPr>
     </w:p>
     <w:p>
       <w:pPr>
@@ -4106,17 +4217,6 @@
     </w:p>
     <w:p>
       <w:pPr>
-        <w:sectPr>
-          <w:type w:val="continuous"/>
-          <w:pgSz w:w="12240" w:h="15840"/>
-          <w:pgMar w:top="1080" w:right="900" w:bottom="1440" w:left="900" w:header="720" w:footer="720" w:gutter="0"/>
-          <w:cols w:space="360" w:num="1"/>
-          <w:docGrid w:linePitch="360"/>
-        </w:sectPr>
-      </w:pPr>
-    </w:p>
-    <w:p>
-      <w:pPr>
         <w:keepNext/>
         <w:spacing w:before="160" w:after="40"/>
         <w:ind w:firstLine="0"/>
@@ -5625,17 +5725,6 @@
         </w:rPr>
         <w:t>To reproducibly map between checks, detector configurations, and reported metrics, the complete experimental inventory across all evaluation corpora is documented in Table III.</w:t>
       </w:r>
-    </w:p>
-    <w:p>
-      <w:pPr>
-        <w:sectPr>
-          <w:type w:val="continuous"/>
-          <w:pgSz w:w="12240" w:h="15840"/>
-          <w:pgMar w:top="1080" w:right="900" w:bottom="1440" w:left="900" w:header="720" w:footer="720" w:gutter="0"/>
-          <w:cols w:space="360" w:num="2"/>
-          <w:docGrid w:linePitch="360"/>
-        </w:sectPr>
-      </w:pPr>
     </w:p>
     <w:p>
       <w:pPr>
@@ -7231,17 +7320,6 @@
     </w:p>
     <w:p>
       <w:pPr>
-        <w:sectPr>
-          <w:type w:val="continuous"/>
-          <w:pgSz w:w="12240" w:h="15840"/>
-          <w:pgMar w:top="1080" w:right="900" w:bottom="1440" w:left="900" w:header="720" w:footer="720" w:gutter="0"/>
-          <w:cols w:space="360" w:num="1"/>
-          <w:docGrid w:linePitch="360"/>
-        </w:sectPr>
-      </w:pPr>
-    </w:p>
-    <w:p>
-      <w:pPr>
         <w:keepNext/>
         <w:spacing w:before="160" w:after="40"/>
         <w:ind w:firstLine="0"/>
@@ -7401,17 +7479,6 @@
         </w:rPr>
         <w:t>Table IV and Fig. 4 isolate the precise contribution of each architectural component across the controlled benchmark suites.</w:t>
       </w:r>
-    </w:p>
-    <w:p>
-      <w:pPr>
-        <w:sectPr>
-          <w:type w:val="continuous"/>
-          <w:pgSz w:w="12240" w:h="15840"/>
-          <w:pgMar w:top="1080" w:right="900" w:bottom="1440" w:left="900" w:header="720" w:footer="720" w:gutter="0"/>
-          <w:cols w:space="360" w:num="2"/>
-          <w:docGrid w:linePitch="360"/>
-        </w:sectPr>
-      </w:pPr>
     </w:p>
     <w:p>
       <w:pPr>
@@ -9223,17 +9290,6 @@
     </w:p>
     <w:p>
       <w:pPr>
-        <w:sectPr>
-          <w:type w:val="continuous"/>
-          <w:pgSz w:w="12240" w:h="15840"/>
-          <w:pgMar w:top="1080" w:right="900" w:bottom="1440" w:left="900" w:header="720" w:footer="720" w:gutter="0"/>
-          <w:cols w:space="360" w:num="1"/>
-          <w:docGrid w:linePitch="360"/>
-        </w:sectPr>
-      </w:pPr>
-    </w:p>
-    <w:p>
-      <w:pPr>
         <w:spacing w:line="252" w:lineRule="auto" w:before="0" w:after="0"/>
         <w:ind w:firstLine="216"/>
         <w:jc w:val="both"/>
@@ -10952,17 +11008,6 @@
     </w:p>
     <w:p>
       <w:pPr>
-        <w:sectPr>
-          <w:type w:val="continuous"/>
-          <w:pgSz w:w="12240" w:h="15840"/>
-          <w:pgMar w:top="1080" w:right="900" w:bottom="1440" w:left="900" w:header="720" w:footer="720" w:gutter="0"/>
-          <w:cols w:space="360" w:num="2"/>
-          <w:docGrid w:linePitch="360"/>
-        </w:sectPr>
-      </w:pPr>
-    </w:p>
-    <w:p>
-      <w:pPr>
         <w:keepNext/>
         <w:spacing w:before="320" w:after="40"/>
         <w:ind w:firstLine="0"/>
@@ -12119,17 +12164,6 @@
     </w:p>
     <w:p>
       <w:pPr>
-        <w:sectPr>
-          <w:type w:val="continuous"/>
-          <w:pgSz w:w="12240" w:h="15840"/>
-          <w:pgMar w:top="1080" w:right="900" w:bottom="1440" w:left="900" w:header="720" w:footer="720" w:gutter="0"/>
-          <w:cols w:space="360" w:num="1"/>
-          <w:docGrid w:linePitch="360"/>
-        </w:sectPr>
-      </w:pPr>
-    </w:p>
-    <w:p>
-      <w:pPr>
         <w:keepNext/>
         <w:spacing w:before="160" w:after="40"/>
         <w:ind w:firstLine="0"/>
@@ -13888,7 +13922,7 @@
     <w:p>
       <w:pPr>
         <w:keepNext/>
-        <w:spacing w:before="220" w:after="80"/>
+        <w:spacing w:before="280" w:after="80"/>
         <w:ind w:firstLine="0"/>
         <w:jc w:val="center"/>
       </w:pPr>
@@ -13903,7 +13937,7 @@
     </w:p>
     <w:p>
       <w:pPr>
-        <w:spacing w:line="252" w:lineRule="auto" w:before="0" w:after="0"/>
+        <w:spacing w:line="252" w:lineRule="auto" w:before="0" w:after="120"/>
         <w:ind w:firstLine="216"/>
         <w:jc w:val="both"/>
       </w:pPr>
@@ -13912,615 +13946,7 @@
           <w:rFonts w:ascii="Times New Roman" w:hAnsi="Times New Roman"/>
           <w:sz w:val="20"/>
         </w:rPr>
-        <w:t>References</w:t>
-      </w:r>
-    </w:p>
-    <w:p>
-      <w:pPr>
-        <w:spacing w:line="252" w:lineRule="auto" w:before="0" w:after="0"/>
-        <w:ind w:firstLine="216"/>
-        <w:jc w:val="both"/>
-      </w:pPr>
-      <w:r>
-        <w:rPr>
-          <w:rFonts w:ascii="Times New Roman" w:hAnsi="Times New Roman"/>
-          <w:sz w:val="20"/>
-        </w:rPr>
-        <w:t>[6]</w:t>
-        <w:tab/>
-        <w:t>Kubernetes Authors, “Pods and sidecar containers,” Kubernetes Documentation, 2024. [Online]. Available: https://kubernetes.io/docs/concepts/workloads/pods/</w:t>
-      </w:r>
-    </w:p>
-    <w:p>
-      <w:pPr>
-        <w:spacing w:line="252" w:lineRule="auto" w:before="0" w:after="0"/>
-        <w:ind w:firstLine="216"/>
-        <w:jc w:val="both"/>
-      </w:pPr>
-      <w:r>
-        <w:rPr>
-          <w:rFonts w:ascii="Times New Roman" w:hAnsi="Times New Roman"/>
-          <w:sz w:val="20"/>
-        </w:rPr>
-        <w:t>[25]</w:t>
-        <w:tab/>
-        <w:t>T. Barik, R. DeLine, S. Drucker, and D. Fisher, “The bones of the system: A case study of logging and telemetry at Microsoft,” in Proc. 38th Int. Conf. Softw. Eng. Companion (ICSE-C), 2016, pp. 92–101.</w:t>
-      </w:r>
-    </w:p>
-    <w:p>
-      <w:pPr>
-        <w:spacing w:line="252" w:lineRule="auto" w:before="0" w:after="0"/>
-        <w:ind w:firstLine="216"/>
-        <w:jc w:val="both"/>
-      </w:pPr>
-      <w:r>
-        <w:rPr>
-          <w:rFonts w:ascii="Times New Roman" w:hAnsi="Times New Roman"/>
-          <w:sz w:val="20"/>
-        </w:rPr>
-        <w:t>[2]</w:t>
-        <w:tab/>
-        <w:t>R. Aghili, H. Li, and F. Khomh, “Protecting privacy in software logs: What should be anonymized?,” Proc. ACM Softw. Eng., vol. 2, no. ISSTA, pp. 1317–1338, 2025.</w:t>
-      </w:r>
-    </w:p>
-    <w:p>
-      <w:pPr>
-        <w:spacing w:line="252" w:lineRule="auto" w:before="0" w:after="0"/>
-        <w:ind w:firstLine="216"/>
-        <w:jc w:val="both"/>
-      </w:pPr>
-      <w:r>
-        <w:rPr>
-          <w:rFonts w:ascii="Times New Roman" w:hAnsi="Times New Roman"/>
-          <w:sz w:val="20"/>
-        </w:rPr>
-        <w:t>[5]</w:t>
-        <w:tab/>
-        <w:t>Datadog Inc., “Observability pipeline sizing and architecture guidelines,” Datadog Technical Documentation, 2024. [Online]. Available: https://docs.datadoghq.com/observability_pipelines/</w:t>
-      </w:r>
-    </w:p>
-    <w:p>
-      <w:pPr>
-        <w:spacing w:line="252" w:lineRule="auto" w:before="0" w:after="0"/>
-        <w:ind w:firstLine="216"/>
-        <w:jc w:val="both"/>
-      </w:pPr>
-      <w:r>
-        <w:rPr>
-          <w:rFonts w:ascii="Times New Roman" w:hAnsi="Times New Roman"/>
-          <w:sz w:val="20"/>
-        </w:rPr>
-        <w:t>[20]</w:t>
-        <w:tab/>
-        <w:t>C. Zhi, J. Yin, J. Han, and S. Deng, “A preliminary study on sensitive information exposure through logging,” in Proc. 27th Asia-Pacific Softw. Eng. Conf. (APSEC), 2020, pp. 470–474.</w:t>
-      </w:r>
-    </w:p>
-    <w:p>
-      <w:pPr>
-        <w:spacing w:line="252" w:lineRule="auto" w:before="0" w:after="0"/>
-        <w:ind w:firstLine="216"/>
-        <w:jc w:val="both"/>
-      </w:pPr>
-      <w:r>
-        <w:rPr>
-          <w:rFonts w:ascii="Times New Roman" w:hAnsi="Times New Roman"/>
-          <w:sz w:val="20"/>
-        </w:rPr>
-        <w:t>[3]</w:t>
-        <w:tab/>
-        <w:t>Z. Wahab, S. Ahmed, M. N. Rahman, R. Shahriyar, and G. Uddin, “Secret leak detection in software issue reports using LLMs: A comprehensive evaluation,” in Proc. IEEE/ACM Int. Conf. Mining Softw. Repositories (MSR), 2025; also arXiv:2410.23657, 2024.</w:t>
-      </w:r>
-    </w:p>
-    <w:p>
-      <w:pPr>
-        <w:spacing w:line="252" w:lineRule="auto" w:before="0" w:after="0"/>
-        <w:ind w:firstLine="216"/>
-        <w:jc w:val="both"/>
-      </w:pPr>
-      <w:r>
-        <w:rPr>
-          <w:rFonts w:ascii="Times New Roman" w:hAnsi="Times New Roman"/>
-          <w:sz w:val="20"/>
-        </w:rPr>
-        <w:t>[22]</w:t>
-        <w:tab/>
-        <w:t>A. O. Portillo-Dominguez and V. Ayala-Rivera, “Towards an efficient log data protection in software systems through data minimization and anonymization,” in Proc. 7th Int. Conf. Softw. Eng. Res. Innov. (CONISOFT), 2019, pp. 107–115.</w:t>
-      </w:r>
-    </w:p>
-    <w:p>
-      <w:pPr>
-        <w:spacing w:line="252" w:lineRule="auto" w:before="0" w:after="0"/>
-        <w:ind w:firstLine="216"/>
-        <w:jc w:val="both"/>
-      </w:pPr>
-      <w:r>
-        <w:rPr>
-          <w:rFonts w:ascii="Times New Roman" w:hAnsi="Times New Roman"/>
-          <w:sz w:val="20"/>
-        </w:rPr>
-        <w:t>[14]</w:t>
-        <w:tab/>
-        <w:t>M. Khoje, “Securing data platforms: Strategic masking techniques for privacy and security for B2B enterprise data,” Int. J. Comput. Trends Technol. (IJCTT), vol. 71, no. 11, pp. 46–54, Nov. 2023.</w:t>
-      </w:r>
-    </w:p>
-    <w:p>
-      <w:pPr>
-        <w:spacing w:line="252" w:lineRule="auto" w:before="0" w:after="0"/>
-        <w:ind w:firstLine="216"/>
-        <w:jc w:val="both"/>
-      </w:pPr>
-      <w:r>
-        <w:rPr>
-          <w:rFonts w:ascii="Times New Roman" w:hAnsi="Times New Roman"/>
-          <w:sz w:val="20"/>
-        </w:rPr>
-        <w:t>[17]</w:t>
-        <w:tab/>
-        <w:t>MITRE Corporation, “CWE-532: Insertion of sensitive information into log file,” Common Weakness Enumeration, 2022. [Online]. Available: https://cwe.mitre.org/data/definitions/532.html</w:t>
-      </w:r>
-    </w:p>
-    <w:p>
-      <w:pPr>
-        <w:spacing w:line="252" w:lineRule="auto" w:before="0" w:after="0"/>
-        <w:ind w:firstLine="216"/>
-        <w:jc w:val="both"/>
-      </w:pPr>
-      <w:r>
-        <w:rPr>
-          <w:rFonts w:ascii="Times New Roman" w:hAnsi="Times New Roman"/>
-          <w:sz w:val="20"/>
-        </w:rPr>
-        <w:t>[15]</w:t>
-        <w:tab/>
-        <w:t>MITRE Corporation, “CWE-798: Use of hard-coded credentials,” Common Weakness Enumeration. [Online]. Available: https://cwe.mitre.org/data/definitions/798.html</w:t>
-      </w:r>
-    </w:p>
-    <w:p>
-      <w:pPr>
-        <w:spacing w:line="252" w:lineRule="auto" w:before="0" w:after="0"/>
-        <w:ind w:firstLine="216"/>
-        <w:jc w:val="both"/>
-      </w:pPr>
-      <w:r>
-        <w:rPr>
-          <w:rFonts w:ascii="Times New Roman" w:hAnsi="Times New Roman"/>
-          <w:sz w:val="20"/>
-        </w:rPr>
-        <w:t>[12]</w:t>
-        <w:tab/>
-        <w:t>GitGuardian, “The state of secrets sprawl 2023,” GitGuardian, Mar. 2023. [Online]. Available: https://blog.gitguardian.com/the-state-of-secrets-sprawl-2023</w:t>
-      </w:r>
-    </w:p>
-    <w:p>
-      <w:pPr>
-        <w:spacing w:line="252" w:lineRule="auto" w:before="0" w:after="0"/>
-        <w:ind w:firstLine="216"/>
-        <w:jc w:val="both"/>
-      </w:pPr>
-      <w:r>
-        <w:rPr>
-          <w:rFonts w:ascii="Times New Roman" w:hAnsi="Times New Roman"/>
-          <w:sz w:val="20"/>
-        </w:rPr>
-        <w:t>[10]</w:t>
-        <w:tab/>
-        <w:t>Z. Rice, “Gitleaks: Protect and discover secrets in code,” GitHub repository, 2024. [Online]. Available: https://github.com/gitleaks/gitleaks</w:t>
-      </w:r>
-    </w:p>
-    <w:p>
-      <w:pPr>
-        <w:spacing w:line="252" w:lineRule="auto" w:before="0" w:after="0"/>
-        <w:ind w:firstLine="216"/>
-        <w:jc w:val="both"/>
-      </w:pPr>
-      <w:r>
-        <w:rPr>
-          <w:rFonts w:ascii="Times New Roman" w:hAnsi="Times New Roman"/>
-          <w:sz w:val="20"/>
-        </w:rPr>
-        <w:t>[4]</w:t>
-        <w:tab/>
-        <w:t>D. Ayrey, “TruffleHog: High entropy secret finder,” GitHub repository, 2024. [Online]. Available: https://github.com/trufflesecurity/trufflehog</w:t>
-      </w:r>
-    </w:p>
-    <w:p>
-      <w:pPr>
-        <w:spacing w:line="252" w:lineRule="auto" w:before="0" w:after="0"/>
-        <w:ind w:firstLine="216"/>
-        <w:jc w:val="both"/>
-      </w:pPr>
-      <w:r>
-        <w:rPr>
-          <w:rFonts w:ascii="Times New Roman" w:hAnsi="Times New Roman"/>
-          <w:sz w:val="20"/>
-        </w:rPr>
-        <w:t>[9]</w:t>
-        <w:tab/>
-        <w:t>Yelp Inc., “detect-secrets: An enterprise-friendly secrets detection module,” GitHub repository, 2024. [Online]. Available: https://github.com/Yelp/detect-secrets</w:t>
-      </w:r>
-    </w:p>
-    <w:p>
-      <w:pPr>
-        <w:spacing w:line="252" w:lineRule="auto" w:before="0" w:after="0"/>
-        <w:ind w:firstLine="216"/>
-        <w:jc w:val="both"/>
-      </w:pPr>
-      <w:r>
-        <w:rPr>
-          <w:rFonts w:ascii="Times New Roman" w:hAnsi="Times New Roman"/>
-          <w:sz w:val="20"/>
-        </w:rPr>
-        <w:t>[24]</w:t>
-        <w:tab/>
-        <w:t>European Parliament and Council of the European Union, “Regulation (EU) 2016/679 on the protection of natural persons with regard to the processing of personal data (General Data Protection Regulation),” Official J. Eur. Union, vol. L119, pp. 1–88, May 2016.</w:t>
-      </w:r>
-    </w:p>
-    <w:p>
-      <w:pPr>
-        <w:spacing w:line="252" w:lineRule="auto" w:before="0" w:after="0"/>
-        <w:ind w:firstLine="216"/>
-        <w:jc w:val="both"/>
-      </w:pPr>
-      <w:r>
-        <w:rPr>
-          <w:rFonts w:ascii="Times New Roman" w:hAnsi="Times New Roman"/>
-          <w:sz w:val="20"/>
-        </w:rPr>
-        <w:t>[32]</w:t>
-        <w:tab/>
-        <w:t>U.S. Congress, “Health Insurance Portability and Accountability Act of 1996,” Pub. L. No. 104-191, 110 Stat. 1936, Aug. 1996.</w:t>
-      </w:r>
-    </w:p>
-    <w:p>
-      <w:pPr>
-        <w:spacing w:line="252" w:lineRule="auto" w:before="0" w:after="0"/>
-        <w:ind w:firstLine="216"/>
-        <w:jc w:val="both"/>
-      </w:pPr>
-      <w:r>
-        <w:rPr>
-          <w:rFonts w:ascii="Times New Roman" w:hAnsi="Times New Roman"/>
-          <w:sz w:val="20"/>
-        </w:rPr>
-        <w:t>[18]</w:t>
-        <w:tab/>
-        <w:t>PCI Security Standards Council, “Payment Card Industry (PCI) Data Security Standard: Requirements and testing procedures, version 4.0,” PCI SSC, Mar. 2022.</w:t>
-      </w:r>
-    </w:p>
-    <w:p>
-      <w:pPr>
-        <w:spacing w:line="252" w:lineRule="auto" w:before="0" w:after="0"/>
-        <w:ind w:firstLine="216"/>
-        <w:jc w:val="both"/>
-      </w:pPr>
-      <w:r>
-        <w:rPr>
-          <w:rFonts w:ascii="Times New Roman" w:hAnsi="Times New Roman"/>
-          <w:sz w:val="20"/>
-        </w:rPr>
-        <w:t>[21]</w:t>
-        <w:tab/>
-        <w:t>Joint Task Force, “Security and privacy controls for information systems and organizations,” Nat. Inst. Standards Technol., Gaithersburg, MD, USA, NIST Special Publication 800-53, Rev. 5, Sep. 2020.</w:t>
-      </w:r>
-    </w:p>
-    <w:p>
-      <w:pPr>
-        <w:spacing w:line="252" w:lineRule="auto" w:before="0" w:after="0"/>
-        <w:ind w:firstLine="216"/>
-        <w:jc w:val="both"/>
-      </w:pPr>
-      <w:r>
-        <w:rPr>
-          <w:rFonts w:ascii="Times New Roman" w:hAnsi="Times New Roman"/>
-          <w:sz w:val="20"/>
-        </w:rPr>
-        <w:t>[19]</w:t>
-        <w:tab/>
-        <w:t>A. Saha, T. Denning, V. Srikumar, and S. K. Kasera, “Secrets in source code: Reducing false positives using machine learning,” in Proc. 12th Int. Conf. Commun. Syst. Netw. (COMSNETS), Bengaluru, India, 2020, pp. 168–175.</w:t>
-      </w:r>
-    </w:p>
-    <w:p>
-      <w:pPr>
-        <w:spacing w:line="252" w:lineRule="auto" w:before="0" w:after="0"/>
-        <w:ind w:firstLine="216"/>
-        <w:jc w:val="both"/>
-      </w:pPr>
-      <w:r>
-        <w:rPr>
-          <w:rFonts w:ascii="Times New Roman" w:hAnsi="Times New Roman"/>
-          <w:sz w:val="20"/>
-        </w:rPr>
-        <w:t>[16]</w:t>
-        <w:tab/>
-        <w:t>S. K. Basak, L. Neil, B. Reaves, and L. Williams, “SecretBench: A dataset of software secrets,” in Proc. IEEE/ACM 20th Int. Conf. Mining Softw. Repositories (MSR), 2023, pp. 347–351.</w:t>
-      </w:r>
-    </w:p>
-    <w:p>
-      <w:pPr>
-        <w:spacing w:line="252" w:lineRule="auto" w:before="0" w:after="0"/>
-        <w:ind w:firstLine="216"/>
-        <w:jc w:val="both"/>
-      </w:pPr>
-      <w:r>
-        <w:rPr>
-          <w:rFonts w:ascii="Times New Roman" w:hAnsi="Times New Roman"/>
-          <w:sz w:val="20"/>
-        </w:rPr>
-        <w:t>[11]</w:t>
-        <w:tab/>
-        <w:t>“Fernet specification,” GitHub repository. [Online]. Available: https://github.com/fernet/spec</w:t>
-      </w:r>
-    </w:p>
-    <w:p>
-      <w:pPr>
-        <w:spacing w:line="252" w:lineRule="auto" w:before="0" w:after="0"/>
-        <w:ind w:firstLine="216"/>
-        <w:jc w:val="both"/>
-      </w:pPr>
-      <w:r>
-        <w:rPr>
-          <w:rFonts w:ascii="Times New Roman" w:hAnsi="Times New Roman"/>
-          <w:sz w:val="20"/>
-        </w:rPr>
-        <w:t>[30]</w:t>
-        <w:tab/>
-        <w:t>Nat. Inst. Standards Technol., “Advanced Encryption Standard (AES),” Federal Information Processing Standards Publication 197, Nov. 2001.</w:t>
-      </w:r>
-    </w:p>
-    <w:p>
-      <w:pPr>
-        <w:spacing w:line="252" w:lineRule="auto" w:before="0" w:after="0"/>
-        <w:ind w:firstLine="216"/>
-        <w:jc w:val="both"/>
-      </w:pPr>
-      <w:r>
-        <w:rPr>
-          <w:rFonts w:ascii="Times New Roman" w:hAnsi="Times New Roman"/>
-          <w:sz w:val="20"/>
-        </w:rPr>
-        <w:t>[31]</w:t>
-        <w:tab/>
-        <w:t>H. Krawczyk, M. Bellare, and R. Canetti, “HMAC: Keyed-hashing for message authentication,” Internet Eng. Task Force, RFC 2104, Feb. 1997.</w:t>
-      </w:r>
-    </w:p>
-    <w:p>
-      <w:pPr>
-        <w:spacing w:line="252" w:lineRule="auto" w:before="0" w:after="0"/>
-        <w:ind w:firstLine="216"/>
-        <w:jc w:val="both"/>
-      </w:pPr>
-      <w:r>
-        <w:rPr>
-          <w:rFonts w:ascii="Times New Roman" w:hAnsi="Times New Roman"/>
-          <w:sz w:val="20"/>
-        </w:rPr>
-        <w:t>[26]</w:t>
-        <w:tab/>
-        <w:t>Nat. Inst. Standards Technol., “Secure Hash Standard (SHS),” Federal Information Processing Standards Publication 180-4, Aug. 2015.</w:t>
-      </w:r>
-    </w:p>
-    <w:p>
-      <w:pPr>
-        <w:spacing w:line="252" w:lineRule="auto" w:before="0" w:after="0"/>
-        <w:ind w:firstLine="216"/>
-        <w:jc w:val="both"/>
-      </w:pPr>
-      <w:r>
-        <w:rPr>
-          <w:rFonts w:ascii="Times New Roman" w:hAnsi="Times New Roman"/>
-          <w:sz w:val="20"/>
-        </w:rPr>
-        <w:t>[7]</w:t>
-        <w:tab/>
-        <w:t>Kubernetes Authors, “Network policies,” Kubernetes Documentation. [Online]. Available: https://kubernetes.io/docs/concepts/services-networking/network-policies/</w:t>
-      </w:r>
-    </w:p>
-    <w:p>
-      <w:pPr>
-        <w:spacing w:line="252" w:lineRule="auto" w:before="0" w:after="0"/>
-        <w:ind w:firstLine="216"/>
-        <w:jc w:val="both"/>
-      </w:pPr>
-      <w:r>
-        <w:rPr>
-          <w:rFonts w:ascii="Times New Roman" w:hAnsi="Times New Roman"/>
-          <w:sz w:val="20"/>
-        </w:rPr>
-        <w:t>[13]</w:t>
-        <w:tab/>
-        <w:t>J. Zhu, S. He, P. He, J. Liu, and M. R. Lyu, “Loghub: A large collection of system log datasets for AI-driven log analytics,” in Proc. 34th IEEE Int. Symp. Softw. Rel. Eng. (ISSRE), 2023, pp. 355–366.</w:t>
-      </w:r>
-    </w:p>
-    <w:p>
-      <w:pPr>
-        <w:spacing w:line="252" w:lineRule="auto" w:before="0" w:after="0"/>
-        <w:ind w:firstLine="216"/>
-        <w:jc w:val="both"/>
-      </w:pPr>
-      <w:r>
-        <w:rPr>
-          <w:rFonts w:ascii="Times New Roman" w:hAnsi="Times New Roman"/>
-          <w:sz w:val="20"/>
-        </w:rPr>
-        <w:t>[29]</w:t>
-        <w:tab/>
-        <w:t>A. J. Slagell and W. Yurcik, “Sharing computer network logs for security and privacy: A motivation for new methodologies of anonymization,” arXiv:cs/0409005, 2004.</w:t>
-      </w:r>
-    </w:p>
-    <w:p>
-      <w:pPr>
-        <w:spacing w:line="252" w:lineRule="auto" w:before="0" w:after="0"/>
-        <w:ind w:firstLine="216"/>
-        <w:jc w:val="both"/>
-      </w:pPr>
-      <w:r>
-        <w:rPr>
-          <w:rFonts w:ascii="Times New Roman" w:hAnsi="Times New Roman"/>
-          <w:sz w:val="20"/>
-        </w:rPr>
-        <w:t>[27]</w:t>
-        <w:tab/>
-        <w:t>A. J. Slagell, K. Lakkaraju, and K. Luo, “FLAIM: A multi-level anonymization framework for computer and network logs,” in Proc. 20th USENIX Large Installation Syst. Admin. Conf. (LISA), 2006, pp. 3–8.</w:t>
-      </w:r>
-    </w:p>
-    <w:p>
-      <w:pPr>
-        <w:spacing w:line="252" w:lineRule="auto" w:before="0" w:after="0"/>
-        <w:ind w:firstLine="216"/>
-        <w:jc w:val="both"/>
-      </w:pPr>
-      <w:r>
-        <w:rPr>
-          <w:rFonts w:ascii="Times New Roman" w:hAnsi="Times New Roman"/>
-          <w:sz w:val="20"/>
-        </w:rPr>
-        <w:t>[23]</w:t>
-        <w:tab/>
-        <w:t>M. Meli, M. R. McNiece, and B. Reaves, “How bad can it git? Characterizing secret leakage in public GitHub repositories,” in Proc. Netw. Distrib. Syst. Security Symp. (NDSS), 2019, pp. 1–15.</w:t>
-      </w:r>
-    </w:p>
-    <w:p>
-      <w:pPr>
-        <w:spacing w:line="252" w:lineRule="auto" w:before="0" w:after="0"/>
-        <w:ind w:firstLine="216"/>
-        <w:jc w:val="both"/>
-      </w:pPr>
-      <w:r>
-        <w:rPr>
-          <w:rFonts w:ascii="Times New Roman" w:hAnsi="Times New Roman"/>
-          <w:sz w:val="20"/>
-        </w:rPr>
-        <w:t>[1]</w:t>
-        <w:tab/>
-        <w:t>M. N. Rahman, S. Ahmed, Z. Wahab, S. M. Sohan, and R. Shahriyar, “Secret breach detection in source code with large language models,” in Proc. 19th ACM/IEEE Int. Symp. Empirical Softw. Eng. Meas. (ESEM), 2025; also arXiv:2504.18784, 2025.</w:t>
-      </w:r>
-    </w:p>
-    <w:p>
-      <w:pPr>
-        <w:spacing w:line="252" w:lineRule="auto" w:before="0" w:after="0"/>
-        <w:ind w:firstLine="216"/>
-        <w:jc w:val="both"/>
-      </w:pPr>
-      <w:r>
-        <w:rPr>
-          <w:rFonts w:ascii="Times New Roman" w:hAnsi="Times New Roman"/>
-          <w:sz w:val="20"/>
-        </w:rPr>
-        <w:t>[8]</w:t>
-        <w:tab/>
-        <w:t>Y. Huang, Y. Li, W. Wu, J. Zhang, and M. R. Lyu, “Your code secret belongs to me: Neural code completion tools can memorize hard-coded credentials,” Proc. ACM Softw. Eng., vol. 1, no. FSE, Art. 111, pp. 1–23, Jul. 2024.</w:t>
-      </w:r>
-    </w:p>
-    <w:p>
-      <w:pPr>
-        <w:spacing w:line="252" w:lineRule="auto" w:before="0" w:after="0"/>
-        <w:ind w:firstLine="216"/>
-        <w:jc w:val="both"/>
-      </w:pPr>
-      <w:r>
-        <w:rPr>
-          <w:rFonts w:ascii="Times New Roman" w:hAnsi="Times New Roman"/>
-          <w:sz w:val="20"/>
-        </w:rPr>
-        <w:t>[35]</w:t>
-        <w:tab/>
-        <w:t>A. V. Aho and M. J. Corasick, “Efficient string matching: An aid to bibliographic search,” Commun. ACM, vol. 18, no. 6, pp. 333–340, Jun. 1975.</w:t>
-      </w:r>
-    </w:p>
-    <w:p>
-      <w:pPr>
-        <w:spacing w:line="252" w:lineRule="auto" w:before="0" w:after="0"/>
-        <w:ind w:firstLine="216"/>
-        <w:jc w:val="both"/>
-      </w:pPr>
-      <w:r>
-        <w:rPr>
-          <w:rFonts w:ascii="Times New Roman" w:hAnsi="Times New Roman"/>
-          <w:sz w:val="20"/>
-        </w:rPr>
-        <w:t>[36]</w:t>
-        <w:tab/>
-        <w:t>C. E. Shannon, “A mathematical theory of communication,” Bell Syst. Tech. J., vol. 27, no. 3, pp. 379–423, Jul. 1948.</w:t>
-      </w:r>
-    </w:p>
-    <w:p>
-      <w:pPr>
-        <w:spacing w:line="252" w:lineRule="auto" w:before="0" w:after="0"/>
-        <w:ind w:firstLine="216"/>
-        <w:jc w:val="both"/>
-      </w:pPr>
-      <w:r>
-        <w:rPr>
-          <w:rFonts w:ascii="Times New Roman" w:hAnsi="Times New Roman"/>
-          <w:sz w:val="20"/>
-        </w:rPr>
-        <w:t>[33]</w:t>
-        <w:tab/>
-        <w:t>D. C. Liu and J. Nocedal, “On the limited memory BFGS method for large scale optimization,” Math. Program., vol. 45, nos. 1–3, pp. 503–528, Aug. 1989.</w:t>
-      </w:r>
-    </w:p>
-    <w:p>
-      <w:pPr>
-        <w:spacing w:line="252" w:lineRule="auto" w:before="0" w:after="0"/>
-        <w:ind w:firstLine="216"/>
-        <w:jc w:val="both"/>
-      </w:pPr>
-      <w:r>
-        <w:rPr>
-          <w:rFonts w:ascii="Times New Roman" w:hAnsi="Times New Roman"/>
-          <w:sz w:val="20"/>
-        </w:rPr>
-        <w:t>[28]</w:t>
-        <w:tab/>
-        <w:t>T. Berners-Lee, R. Fielding, and L. Masinter, “Uniform Resource Identifier (URI): Generic syntax,” Internet Eng. Task Force, RFC 3986, Jan. 2005.</w:t>
-      </w:r>
-    </w:p>
-    <w:p>
-      <w:pPr>
-        <w:spacing w:line="252" w:lineRule="auto" w:before="0" w:after="0"/>
-        <w:ind w:firstLine="216"/>
-        <w:jc w:val="both"/>
-      </w:pPr>
-      <w:r>
-        <w:rPr>
-          <w:rFonts w:ascii="Times New Roman" w:hAnsi="Times New Roman"/>
-          <w:sz w:val="20"/>
-        </w:rPr>
-        <w:t>[37]</w:t>
-        <w:tab/>
-        <w:t>Q. McNemar, “Note on the sampling error of the difference between correlated proportions or percentages,” Psychometrika, vol. 12, no. 2, pp. 153–157, Jun. 1947.</w:t>
-      </w:r>
-    </w:p>
-    <w:p>
-      <w:pPr>
-        <w:spacing w:line="252" w:lineRule="auto" w:before="0" w:after="0"/>
-        <w:ind w:firstLine="216"/>
-        <w:jc w:val="both"/>
-      </w:pPr>
-      <w:r>
-        <w:rPr>
-          <w:rFonts w:ascii="Times New Roman" w:hAnsi="Times New Roman"/>
-          <w:sz w:val="20"/>
-        </w:rPr>
-        <w:t>[34]</w:t>
-        <w:tab/>
-        <w:t>J. A. Hanley and A. Lippman-Hand, “If nothing goes wrong, is everything all right? Interpreting zero numerators,” JAMA, vol. 249, no. 13, pp. 1743–1745, Apr. 1983.</w:t>
-      </w:r>
-    </w:p>
-    <w:p>
-      <w:pPr>
-        <w:spacing w:line="252" w:lineRule="auto" w:before="0" w:after="0"/>
-        <w:ind w:firstLine="216"/>
-        <w:jc w:val="both"/>
-      </w:pPr>
-      <w:r>
-        <w:rPr>
-          <w:rFonts w:ascii="Times New Roman" w:hAnsi="Times New Roman"/>
-          <w:sz w:val="20"/>
-        </w:rPr>
-        <w:t>[38]</w:t>
-        <w:tab/>
-        <w:t>C. J. Clopper and E. S. Pearson, “The use of confidence or fiducial limits illustrated in the case of the binomial,” Biometrika, vol. 26, no. 4, pp. 404–413, Dec. 1934.</w:t>
+        <w:t>The authors thank the maintainers of SecretBench, TruffleHog, and Gitleaks for open-sourcing their detection datasets and rule engines. We also thank the Department of Computer Engineering at NMIMS University for providing computing facilities and laboratory infrastructure for our Kubernetes testbed cluster.</w:t>
       </w:r>
     </w:p>
     <w:p>

</xml_diff>